<commit_message>
Update algorithm docs and flowchart
This commit refreshes the algorithm documents and replaces the older flowchart image with an updated version. The Word files were revised, and the previous draw.io export was removed in favor of the new flowchart asset.
</commit_message>
<xml_diff>
--- a/Algorithm - Copy.docx
+++ b/Algorithm - Copy.docx
@@ -1,6 +1,6 @@
 
 <file path=word/document.xml><?xml version="1.0" encoding="utf-8"?>
-<w:document xmlns:wpc="http://schemas.microsoft.com/office/word/2010/wordprocessingCanvas" xmlns:cx="http://schemas.microsoft.com/office/drawing/2014/chartex" xmlns:cx1="http://schemas.microsoft.com/office/drawing/2015/9/8/chartex" xmlns:cx2="http://schemas.microsoft.com/office/drawing/2015/10/21/chartex" xmlns:cx3="http://schemas.microsoft.com/office/drawing/2016/5/9/chartex" xmlns:cx4="http://schemas.microsoft.com/office/drawing/2016/5/10/chartex" xmlns:cx5="http://schemas.microsoft.com/office/drawing/2016/5/11/chartex" xmlns:cx6="http://schemas.microsoft.com/office/drawing/2016/5/12/chartex" xmlns:cx7="http://schemas.microsoft.com/office/drawing/2016/5/13/chartex" xmlns:cx8="http://schemas.microsoft.com/office/drawing/2016/5/14/chartex" xmlns:mc="http://schemas.openxmlformats.org/markup-compatibility/2006" xmlns:aink="http://schemas.microsoft.com/office/drawing/2016/ink" xmlns:am3d="http://schemas.microsoft.com/office/drawing/2017/model3d" xmlns:o="urn:schemas-microsoft-com:office:office" xmlns:r="http://schemas.openxmlformats.org/officeDocument/2006/relationships" xmlns:m="http://schemas.openxmlformats.org/officeDocument/2006/math" xmlns:v="urn:schemas-microsoft-com:vml" xmlns:wp14="http://schemas.microsoft.com/office/word/2010/wordprocessingDrawing" xmlns:wp="http://schemas.openxmlformats.org/drawingml/2006/wordprocessingDrawing" xmlns:w10="urn:schemas-microsoft-com:office:word" xmlns:w="http://schemas.openxmlformats.org/wordprocessingml/2006/main" xmlns:w14="http://schemas.microsoft.com/office/word/2010/wordml" xmlns:w15="http://schemas.microsoft.com/office/word/2012/wordml" xmlns:w16cex="http://schemas.microsoft.com/office/word/2018/wordml/cex" xmlns:w16cid="http://schemas.microsoft.com/office/word/2016/wordml/cid" xmlns:w16="http://schemas.microsoft.com/office/word/2018/wordml" xmlns:w16sdtdh="http://schemas.microsoft.com/office/word/2020/wordml/sdtdatahash" xmlns:w16se="http://schemas.microsoft.com/office/word/2015/wordml/symex" xmlns:wpg="http://schemas.microsoft.com/office/word/2010/wordprocessingGroup" xmlns:wpi="http://schemas.microsoft.com/office/word/2010/wordprocessingInk" xmlns:wne="http://schemas.microsoft.com/office/word/2006/wordml" xmlns:wps="http://schemas.microsoft.com/office/word/2010/wordprocessingShape" mc:Ignorable="w14 w15 w16se w16cid w16 w16cex w16sdtdh wp14">
+<w:document xmlns:wpc="http://schemas.microsoft.com/office/word/2010/wordprocessingCanvas" xmlns:cx="http://schemas.microsoft.com/office/drawing/2014/chartex" xmlns:cx1="http://schemas.microsoft.com/office/drawing/2015/9/8/chartex" xmlns:cx2="http://schemas.microsoft.com/office/drawing/2015/10/21/chartex" xmlns:cx3="http://schemas.microsoft.com/office/drawing/2016/5/9/chartex" xmlns:cx4="http://schemas.microsoft.com/office/drawing/2016/5/10/chartex" xmlns:cx5="http://schemas.microsoft.com/office/drawing/2016/5/11/chartex" xmlns:cx6="http://schemas.microsoft.com/office/drawing/2016/5/12/chartex" xmlns:cx7="http://schemas.microsoft.com/office/drawing/2016/5/13/chartex" xmlns:cx8="http://schemas.microsoft.com/office/drawing/2016/5/14/chartex" xmlns:mc="http://schemas.openxmlformats.org/markup-compatibility/2006" xmlns:aink="http://schemas.microsoft.com/office/drawing/2016/ink" xmlns:am3d="http://schemas.microsoft.com/office/drawing/2017/model3d" xmlns:o="urn:schemas-microsoft-com:office:office" xmlns:oel="http://schemas.microsoft.com/office/2019/extlst" xmlns:r="http://schemas.openxmlformats.org/officeDocument/2006/relationships" xmlns:m="http://schemas.openxmlformats.org/officeDocument/2006/math" xmlns:v="urn:schemas-microsoft-com:vml" xmlns:wp14="http://schemas.microsoft.com/office/word/2010/wordprocessingDrawing" xmlns:wp="http://schemas.openxmlformats.org/drawingml/2006/wordprocessingDrawing" xmlns:w10="urn:schemas-microsoft-com:office:word" xmlns:w="http://schemas.openxmlformats.org/wordprocessingml/2006/main" xmlns:w14="http://schemas.microsoft.com/office/word/2010/wordml" xmlns:w15="http://schemas.microsoft.com/office/word/2012/wordml" xmlns:w16cex="http://schemas.microsoft.com/office/word/2018/wordml/cex" xmlns:w16cid="http://schemas.microsoft.com/office/word/2016/wordml/cid" xmlns:w16="http://schemas.microsoft.com/office/word/2018/wordml" xmlns:w16du="http://schemas.microsoft.com/office/word/2023/wordml/word16du" xmlns:w16sdtdh="http://schemas.microsoft.com/office/word/2020/wordml/sdtdatahash" xmlns:w16sdtfl="http://schemas.microsoft.com/office/word/2024/wordml/sdtformatlock" xmlns:w16se="http://schemas.microsoft.com/office/word/2015/wordml/symex" xmlns:wpg="http://schemas.microsoft.com/office/word/2010/wordprocessingGroup" xmlns:wpi="http://schemas.microsoft.com/office/word/2010/wordprocessingInk" xmlns:wne="http://schemas.microsoft.com/office/word/2006/wordml" xmlns:wps="http://schemas.microsoft.com/office/word/2010/wordprocessingShape" mc:Ignorable="w14 w15 w16se w16cid w16 w16cex w16sdtdh w16sdtfl w16du wp14">
   <w:body>
     <w:p>
       <w:pPr>
@@ -65,15 +65,7 @@
     <w:p>
       <w:r>
         <w:tab/>
-        <w:t xml:space="preserve">Input </w:t>
-      </w:r>
-      <w:proofErr w:type="gramStart"/>
-      <w:r>
-        <w:t>trucks ,</w:t>
-      </w:r>
-      <w:proofErr w:type="gramEnd"/>
-      <w:r>
-        <w:t xml:space="preserve"> </w:t>
+        <w:t xml:space="preserve">Input trucks , </w:t>
       </w:r>
       <w:proofErr w:type="spellStart"/>
       <w:r>
@@ -96,10 +88,35 @@
     </w:p>
     <w:p>
       <w:r>
-        <w:t xml:space="preserve">6. input </w:t>
+        <w:t xml:space="preserve">6. </w:t>
       </w:r>
       <w:proofErr w:type="spellStart"/>
       <w:r>
+        <w:t>Output:”</w:t>
+      </w:r>
+      <w:r>
+        <w:t>P</w:t>
+      </w:r>
+      <w:r>
+        <w:t>redict</w:t>
+      </w:r>
+      <w:proofErr w:type="spellEnd"/>
+      <w:r>
+        <w:t xml:space="preserve"> the </w:t>
+      </w:r>
+      <w:r>
+        <w:t>trapped people under rubble?(y/n)”</w:t>
+      </w:r>
+    </w:p>
+    <w:p>
+      <w:r>
+        <w:t>7</w:t>
+      </w:r>
+      <w:r>
+        <w:t xml:space="preserve">. input </w:t>
+      </w:r>
+      <w:proofErr w:type="spellStart"/>
+      <w:r>
         <w:t>new_disaster</w:t>
       </w:r>
       <w:proofErr w:type="spellEnd"/>
@@ -109,7 +126,10 @@
     </w:p>
     <w:p>
       <w:r>
-        <w:t>7.</w:t>
+        <w:t>8</w:t>
+      </w:r>
+      <w:r>
+        <w:t>.</w:t>
       </w:r>
       <w:r>
         <w:t xml:space="preserve"> </w:t>
@@ -171,7 +191,10 @@
     </w:p>
     <w:p>
       <w:r>
-        <w:t xml:space="preserve">8. </w:t>
+        <w:t>9</w:t>
+      </w:r>
+      <w:r>
+        <w:t xml:space="preserve">. </w:t>
       </w:r>
       <w:r>
         <w:t xml:space="preserve"> </w:t>
@@ -194,7 +217,10 @@
     </w:p>
     <w:p>
       <w:r>
-        <w:t>9. Give the best solution with minimum deaths.</w:t>
+        <w:t>10</w:t>
+      </w:r>
+      <w:r>
+        <w:t>. Give the best solution with minimum deaths.</w:t>
       </w:r>
     </w:p>
     <w:sectPr>
@@ -208,7 +234,7 @@
 </file>
 
 <file path=word/styles.xml><?xml version="1.0" encoding="utf-8"?>
-<w:styles xmlns:mc="http://schemas.openxmlformats.org/markup-compatibility/2006" xmlns:r="http://schemas.openxmlformats.org/officeDocument/2006/relationships" xmlns:w="http://schemas.openxmlformats.org/wordprocessingml/2006/main" xmlns:w14="http://schemas.microsoft.com/office/word/2010/wordml" xmlns:w15="http://schemas.microsoft.com/office/word/2012/wordml" xmlns:w16cex="http://schemas.microsoft.com/office/word/2018/wordml/cex" xmlns:w16cid="http://schemas.microsoft.com/office/word/2016/wordml/cid" xmlns:w16="http://schemas.microsoft.com/office/word/2018/wordml" xmlns:w16sdtdh="http://schemas.microsoft.com/office/word/2020/wordml/sdtdatahash" xmlns:w16se="http://schemas.microsoft.com/office/word/2015/wordml/symex" mc:Ignorable="w14 w15 w16se w16cid w16 w16cex w16sdtdh">
+<w:styles xmlns:mc="http://schemas.openxmlformats.org/markup-compatibility/2006" xmlns:r="http://schemas.openxmlformats.org/officeDocument/2006/relationships" xmlns:w="http://schemas.openxmlformats.org/wordprocessingml/2006/main" xmlns:w14="http://schemas.microsoft.com/office/word/2010/wordml" xmlns:w15="http://schemas.microsoft.com/office/word/2012/wordml" xmlns:w16cex="http://schemas.microsoft.com/office/word/2018/wordml/cex" xmlns:w16cid="http://schemas.microsoft.com/office/word/2016/wordml/cid" xmlns:w16="http://schemas.microsoft.com/office/word/2018/wordml" xmlns:w16du="http://schemas.microsoft.com/office/word/2023/wordml/word16du" xmlns:w16sdtdh="http://schemas.microsoft.com/office/word/2020/wordml/sdtdatahash" xmlns:w16sdtfl="http://schemas.microsoft.com/office/word/2024/wordml/sdtformatlock" xmlns:w16se="http://schemas.microsoft.com/office/word/2015/wordml/symex" mc:Ignorable="w14 w15 w16se w16cid w16 w16cex w16sdtdh w16sdtfl w16du">
   <w:docDefaults>
     <w:rPrDefault>
       <w:rPr>

</xml_diff>